<commit_message>
Revise teaching CV: 2018 start, no certification, no school names
- Teaching experience now runs from 2018, starting with private tutoring
  in Morocco alongside university study and continuing in Shenzhen.
- Removed the TEFL/TESOL certification section.
- Replaced school-name placeholders with generic descriptors.
- Removed the remaining university placeholder and the references line.

Still one A4 page in PDF; DOCX regenerated to match.

Co-Authored-By: Claude Opus 5 <noreply@anthropic.com>
Claude-Session: https://claude.ai/code/session_012Zatsfw6xc1NdxPAVuFq8K
</commit_message>
<xml_diff>
--- a/cv/achouak-yassine-teaching-cv.docx
+++ b/cv/achouak-yassine-teaching-cv.docx
@@ -65,7 +65,7 @@
         <w:jc w:val="both"/>
       </w:pPr>
       <w:r>
-        <w:t>Dedicated and energetic English language teacher with three years of classroom experience across kindergartens and primary schools in Shenzhen, alongside a sustained private tutoring practice. Skilled at creating fully English-immersive classrooms where young learners speak from the first lesson, combining phonics-based literacy instruction with Total Physical Response, song, storytelling and play. Known for excellent classroom management, warm rapport with students and clear communication with Chinese co-teachers and parents — with a track record of real gains in learners' oral confidence, pronunciation and reading readiness.</w:t>
+        <w:t>Dedicated and energetic English language teacher with seven years of experience, beginning with private tutoring in Morocco in 2018 and continuing across kindergartens and primary schools in Shenzhen since 2023. Skilled at creating fully English-immersive classrooms where young learners speak from the first lesson, combining phonics-based literacy instruction with Total Physical Response, song, storytelling and play. Known for excellent classroom management, warm rapport with students and clear communication with Chinese co-teachers and parents — with a track record of real gains in learners' oral confidence, pronunciation and reading readiness.</w:t>
       </w:r>
     </w:p>
     <w:p>
@@ -119,7 +119,7 @@
           <w:color w:val="4A5158"/>
           <w:sz w:val="17"/>
         </w:rPr>
-        <w:t>[Kindergarten name], Shenzhen, China</w:t>
+        <w:t>Private kindergarten · Shenzhen, China</w:t>
       </w:r>
     </w:p>
     <w:p>
@@ -221,7 +221,7 @@
           <w:color w:val="4A5158"/>
           <w:sz w:val="17"/>
         </w:rPr>
-        <w:t>[Primary school name], Shenzhen, China</w:t>
+        <w:t>Primary school · Shenzhen, China</w:t>
       </w:r>
     </w:p>
     <w:p>
@@ -310,7 +310,7 @@
           <w:sz w:val="17"/>
         </w:rPr>
         <w:tab/>
-        <w:t>2023 – Present</w:t>
+        <w:t>2018 – Present</w:t>
       </w:r>
     </w:p>
     <w:p>
@@ -323,7 +323,20 @@
           <w:color w:val="4A5158"/>
           <w:sz w:val="17"/>
         </w:rPr>
-        <w:t>Independent · Shenzhen, China</w:t>
+        <w:t>Independent · Morocco, then Shenzhen, China</w:t>
+      </w:r>
+    </w:p>
+    <w:p>
+      <w:pPr>
+        <w:pStyle w:val="ListBullet"/>
+        <w:spacing w:after="30"/>
+        <w:ind w:left="283" w:hanging="170"/>
+      </w:pPr>
+      <w:r>
+        <w:rPr>
+          <w:sz w:val="19"/>
+        </w:rPr>
+        <w:t>Began tutoring school-age students in Morocco in 2018 alongside university study, and carried the practice to Shenzhen on relocating.</w:t>
       </w:r>
     </w:p>
     <w:p>
@@ -549,7 +562,7 @@
           <w:sz w:val="17"/>
           <w:spacing w:val="32"/>
         </w:rPr>
-        <w:t>EDUCATION &amp; CERTIFICATION</w:t>
+        <w:t>EDUCATION</w:t>
       </w:r>
     </w:p>
     <w:p>
@@ -573,7 +586,7 @@
           <w:color w:val="15181C"/>
           <w:sz w:val="19"/>
         </w:rPr>
-        <w:t xml:space="preserve"> — [University name], Morocco</w:t>
+        <w:t xml:space="preserve"> — Morocco</w:t>
       </w:r>
       <w:r>
         <w:rPr>
@@ -582,38 +595,6 @@
         </w:rPr>
         <w:tab/>
         <w:t>2018 – 2022</w:t>
-      </w:r>
-    </w:p>
-    <w:p>
-      <w:pPr>
-        <w:tabs>
-          <w:tab w:pos="10318" w:val="right"/>
-        </w:tabs>
-        <w:spacing w:before="0" w:after="40"/>
-      </w:pPr>
-      <w:r>
-        <w:rPr>
-          <w:b/>
-          <w:color w:val="15181C"/>
-          <w:sz w:val="19"/>
-        </w:rPr>
-        <w:t>[TEFL / TESOL certificate — provider]</w:t>
-      </w:r>
-      <w:r>
-        <w:rPr>
-          <w:b w:val="0"/>
-          <w:color w:val="15181C"/>
-          <w:sz w:val="19"/>
-        </w:rPr>
-        <w:t>, [hours]</w:t>
-      </w:r>
-      <w:r>
-        <w:rPr>
-          <w:color w:val="4A5158"/>
-          <w:sz w:val="17"/>
-        </w:rPr>
-        <w:tab/>
-        <w:t>[Year]</w:t>
       </w:r>
     </w:p>
     <w:p>
@@ -748,18 +729,6 @@
     <w:p>
       <w:r>
         <w:t>International sets demanding clear communication, presence before an audience and composure under pressure; photography and video skills applied directly to producing engaging visual teaching materials.</w:t>
-      </w:r>
-    </w:p>
-    <w:p>
-      <w:pPr>
-        <w:spacing w:before="120"/>
-      </w:pPr>
-      <w:r>
-        <w:rPr>
-          <w:color w:val="4A5158"/>
-          <w:sz w:val="17"/>
-        </w:rPr>
-        <w:t>References available on request.</w:t>
       </w:r>
     </w:p>
     <w:sectPr>

</xml_diff>

<commit_message>
Add HITSZ master's and a strengths section to the teaching CV
- Education now leads with the in-progress master's at Harbin Institute
  of Technology, Shenzhen (HITSZ).
- New "Why I'm a Strong Fit" band covering long-term commitment to
  Shenzhen, Mandarin ability, media/content skills and classroom tech.
- Key Skills swapped in teaching-material/video design and the
  Mandarin-speaking, China-based line.
- Trimmed the profile and bullets that the new section made redundant so
  the PDF still fits one A4 page; DOCX regenerated to match.

Co-Authored-By: Claude Opus 5 <noreply@anthropic.com>
Claude-Session: https://claude.ai/code/session_012Zatsfw6xc1NdxPAVuFq8K
</commit_message>
<xml_diff>
--- a/cv/achouak-yassine-teaching-cv.docx
+++ b/cv/achouak-yassine-teaching-cv.docx
@@ -65,7 +65,104 @@
         <w:jc w:val="both"/>
       </w:pPr>
       <w:r>
-        <w:t>Dedicated and energetic English language teacher with seven years of experience, beginning with private tutoring in Morocco in 2018 and continuing across kindergartens and primary schools in Shenzhen since 2023. Skilled at creating fully English-immersive classrooms where young learners speak from the first lesson, combining phonics-based literacy instruction with Total Physical Response, song, storytelling and play. Known for excellent classroom management, warm rapport with students and clear communication with Chinese co-teachers and parents — with a track record of real gains in learners' oral confidence, pronunciation and reading readiness.</w:t>
+        <w:t>English language teacher with seven years of experience, beginning with private tutoring in Morocco in 2018 and continuing across kindergartens and primary schools in Shenzhen since 2023. I build fully English-immersive classrooms where young learners speak from the first lesson, combining phonics-based literacy work with Total Physical Response, song, storytelling and play — and I manage large groups of children calmly, with real gains in their oral confidence, pronunciation and reading readiness.</w:t>
+      </w:r>
+    </w:p>
+    <w:p>
+      <w:pPr>
+        <w:spacing w:before="160" w:after="60"/>
+        <w:pBdr>
+          <w:bottom w:val="single" w:sz="4" w:space="2" w:color="C8CDD3"/>
+        </w:pBdr>
+      </w:pPr>
+      <w:r>
+        <w:rPr>
+          <w:b/>
+          <w:color w:val="15181C"/>
+          <w:sz w:val="17"/>
+          <w:spacing w:val="32"/>
+        </w:rPr>
+        <w:t>WHY I'M A STRONG FIT</w:t>
+      </w:r>
+    </w:p>
+    <w:p>
+      <w:pPr>
+        <w:pStyle w:val="ListBullet"/>
+        <w:spacing w:after="30"/>
+        <w:ind w:left="283" w:hanging="170"/>
+      </w:pPr>
+      <w:r>
+        <w:rPr>
+          <w:b/>
+          <w:sz w:val="19"/>
+        </w:rPr>
+        <w:t>Settled in Shenzhen for the long term</w:t>
+      </w:r>
+      <w:r>
+        <w:rPr>
+          <w:sz w:val="19"/>
+        </w:rPr>
+        <w:t xml:space="preserve"> — currently completing a master's degree at Harbin Institute of Technology, Shenzhen (HITSZ), so I can commit to full academic years without turnover risk.</w:t>
+      </w:r>
+    </w:p>
+    <w:p>
+      <w:pPr>
+        <w:pStyle w:val="ListBullet"/>
+        <w:spacing w:after="30"/>
+        <w:ind w:left="283" w:hanging="170"/>
+      </w:pPr>
+      <w:r>
+        <w:rPr>
+          <w:b/>
+          <w:sz w:val="19"/>
+        </w:rPr>
+        <w:t>Works with Chinese colleagues and parents in Mandarin</w:t>
+      </w:r>
+      <w:r>
+        <w:rPr>
+          <w:sz w:val="19"/>
+        </w:rPr>
+        <w:t xml:space="preserve"> — no interpreter needed day to day, and I know first-hand what learning a second language actually demands.</w:t>
+      </w:r>
+    </w:p>
+    <w:p>
+      <w:pPr>
+        <w:pStyle w:val="ListBullet"/>
+        <w:spacing w:after="30"/>
+        <w:ind w:left="283" w:hanging="170"/>
+      </w:pPr>
+      <w:r>
+        <w:rPr>
+          <w:b/>
+          <w:sz w:val="19"/>
+        </w:rPr>
+        <w:t>Brings media skills the school can use</w:t>
+      </w:r>
+      <w:r>
+        <w:rPr>
+          <w:sz w:val="19"/>
+        </w:rPr>
+        <w:t xml:space="preserve"> — I design my own teaching materials and shoot and edit photography and video for lessons, open days and the school's promotional channels.</w:t>
+      </w:r>
+    </w:p>
+    <w:p>
+      <w:pPr>
+        <w:pStyle w:val="ListBullet"/>
+        <w:spacing w:after="30"/>
+        <w:ind w:left="283" w:hanging="170"/>
+      </w:pPr>
+      <w:r>
+        <w:rPr>
+          <w:b/>
+          <w:sz w:val="19"/>
+        </w:rPr>
+        <w:t>Comfortable with classroom and online technology</w:t>
+      </w:r>
+      <w:r>
+        <w:rPr>
+          <w:sz w:val="19"/>
+        </w:rPr>
+        <w:t xml:space="preserve"> — a computer science background makes smartboards, online platforms and digital materials routine.</w:t>
       </w:r>
     </w:p>
     <w:p>
@@ -158,19 +255,6 @@
         <w:rPr>
           <w:sz w:val="19"/>
         </w:rPr>
-        <w:t>Design and produce original classroom materials — visual aids, flashcard sets, props and short video clips — tailored to each unit's theme.</w:t>
-      </w:r>
-    </w:p>
-    <w:p>
-      <w:pPr>
-        <w:pStyle w:val="ListBullet"/>
-        <w:spacing w:after="30"/>
-        <w:ind w:left="283" w:hanging="170"/>
-      </w:pPr>
-      <w:r>
-        <w:rPr>
-          <w:sz w:val="19"/>
-        </w:rPr>
         <w:t>Partner closely with Chinese homeroom teachers and assistants to align English content with the wider curriculum and support children who need extra attention.</w:t>
       </w:r>
     </w:p>
@@ -184,7 +268,7 @@
         <w:rPr>
           <w:sz w:val="19"/>
         </w:rPr>
-        <w:t>Lead the English segments of open days, festivals and parent showcases, coaching children through songs, chants and short performances.</w:t>
+        <w:t>Lead the English segments of open days and parent showcases, coaching children through songs, chants and short performances.</w:t>
       </w:r>
     </w:p>
     <w:p>
@@ -234,7 +318,7 @@
         <w:rPr>
           <w:sz w:val="19"/>
         </w:rPr>
-        <w:t>Taught structured English lessons across multiple grade levels, covering speaking, listening, reading, phonics and foundational grammar in line with the school's curriculum and textbook scheme.</w:t>
+        <w:t>Taught structured lessons across multiple grade levels, covering speaking, listening, reading, phonics and foundational grammar in line with the school's textbook scheme.</w:t>
       </w:r>
     </w:p>
     <w:p>
@@ -247,7 +331,7 @@
         <w:rPr>
           <w:sz w:val="19"/>
         </w:rPr>
-        <w:t>Ran oral English and pronunciation sessions that moved students from single-word answers to full sentences and short presentations in front of their peers.</w:t>
+        <w:t>Ran oral English and pronunciation sessions that moved students from single-word answers to full sentences and short presentations.</w:t>
       </w:r>
     </w:p>
     <w:p>
@@ -273,20 +357,7 @@
         <w:rPr>
           <w:sz w:val="19"/>
         </w:rPr>
-        <w:t>Assessed progress through observation, quizzes and speaking checks, reporting outcomes to homeroom teachers and parents.</w:t>
-      </w:r>
-    </w:p>
-    <w:p>
-      <w:pPr>
-        <w:pStyle w:val="ListBullet"/>
-        <w:spacing w:after="30"/>
-        <w:ind w:left="283" w:hanging="170"/>
-      </w:pPr>
-      <w:r>
-        <w:rPr>
-          <w:sz w:val="19"/>
-        </w:rPr>
-        <w:t>Held an orderly, positive atmosphere in groups of 30–40 students through consistent routines and positive reinforcement.</w:t>
+        <w:t>Assessed progress through observation, quizzes and speaking checks, reporting to homeroom teachers and parents, and held an orderly, positive atmosphere in groups of 30–40 students.</w:t>
       </w:r>
     </w:p>
     <w:p>
@@ -336,7 +407,7 @@
         <w:rPr>
           <w:sz w:val="19"/>
         </w:rPr>
-        <w:t>Began tutoring school-age students in Morocco in 2018 alongside university study, and carried the practice to Shenzhen on relocating.</w:t>
+        <w:t>Began tutoring school-age students in Morocco in 2018 alongside university study, and carried the practice to Shenzhen.</w:t>
       </w:r>
     </w:p>
     <w:p>
@@ -349,20 +420,7 @@
         <w:rPr>
           <w:sz w:val="19"/>
         </w:rPr>
-        <w:t>Deliver tailored tutoring to children and adult learners, building individual study plans around each student's level, goals and timeline.</w:t>
-      </w:r>
-    </w:p>
-    <w:p>
-      <w:pPr>
-        <w:pStyle w:val="ListBullet"/>
-        <w:spacing w:after="30"/>
-        <w:ind w:left="283" w:hanging="170"/>
-      </w:pPr>
-      <w:r>
-        <w:rPr>
-          <w:sz w:val="19"/>
-        </w:rPr>
-        <w:t>Focus on conversational fluency, pronunciation, everyday vocabulary and exam-oriented practice, adapting pace and materials lesson by lesson.</w:t>
+        <w:t>Deliver tailored tutoring to children and adults, building study plans around each student's level and goals, with a focus on conversational fluency, pronunciation and exam-oriented practice.</w:t>
       </w:r>
     </w:p>
     <w:p>
@@ -516,7 +574,7 @@
               <w:rPr>
                 <w:sz w:val="19"/>
               </w:rPr>
-              <w:t>Original teaching-material design</w:t>
+              <w:t>Original teaching-material &amp; video design</w:t>
             </w:r>
           </w:p>
           <w:p>
@@ -542,7 +600,7 @@
               <w:rPr>
                 <w:sz w:val="19"/>
               </w:rPr>
-              <w:t>Cross-cultural communication &amp; teamwork</w:t>
+              <w:t>Mandarin-speaking, China-based since 2023</w:t>
             </w:r>
           </w:p>
         </w:tc>
@@ -563,6 +621,38 @@
           <w:spacing w:val="32"/>
         </w:rPr>
         <w:t>EDUCATION</w:t>
+      </w:r>
+    </w:p>
+    <w:p>
+      <w:pPr>
+        <w:tabs>
+          <w:tab w:pos="10318" w:val="right"/>
+        </w:tabs>
+        <w:spacing w:before="0" w:after="40"/>
+      </w:pPr>
+      <w:r>
+        <w:rPr>
+          <w:b/>
+          <w:color w:val="15181C"/>
+          <w:sz w:val="19"/>
+        </w:rPr>
+        <w:t>Master's Degree</w:t>
+      </w:r>
+      <w:r>
+        <w:rPr>
+          <w:b w:val="0"/>
+          <w:color w:val="15181C"/>
+          <w:sz w:val="19"/>
+        </w:rPr>
+        <w:t xml:space="preserve"> — Harbin Institute of Technology, Shenzhen (HITSZ), China</w:t>
+      </w:r>
+      <w:r>
+        <w:rPr>
+          <w:color w:val="4A5158"/>
+          <w:sz w:val="17"/>
+        </w:rPr>
+        <w:tab/>
+        <w:t>In progress</w:t>
       </w:r>
     </w:p>
     <w:p>
@@ -714,21 +804,8 @@
       </w:r>
     </w:p>
     <w:p>
-      <w:pPr>
-        <w:spacing w:after="40"/>
-      </w:pPr>
       <w:r>
-        <w:rPr>
-          <w:i/>
-          <w:color w:val="4A5158"/>
-          <w:sz w:val="17"/>
-        </w:rPr>
-        <w:t>Morocco &amp; Shenzhen, China</w:t>
-      </w:r>
-    </w:p>
-    <w:p>
-      <w:r>
-        <w:t>International sets demanding clear communication, presence before an audience and composure under pressure; photography and video skills applied directly to producing engaging visual teaching materials.</w:t>
+        <w:t>Morocco &amp; Shenzhen. The source of the presence, composure and photo and video skills I bring into the classroom.</w:t>
       </w:r>
     </w:p>
     <w:sectPr>

</xml_diff>

<commit_message>
Name the master's field and dates, widen Key Skills to fifteen
- Education now reads "Master's Degree in Computer Science — Harbin
  Institute of Technology, Shenzhen (HITSZ), 2024 – Present".
- Key Skills regrouped into three columns of five (teaching craft,
  delivery and assessment, beyond the classroom), taking the list from
  ten items to fifteen in the same vertical space.

PDF still fits one A4 page; DOCX regenerated to match.

Co-Authored-By: Claude Opus 5 <noreply@anthropic.com>
Claude-Session: https://claude.ai/code/session_012Zatsfw6xc1NdxPAVuFq8K
</commit_message>
<xml_diff>
--- a/cv/achouak-yassine-teaching-cv.docx
+++ b/cv/achouak-yassine-teaching-cv.docx
@@ -460,58 +460,59 @@
         <w:tblLook w:firstColumn="1" w:firstRow="1" w:lastColumn="0" w:lastRow="0" w:noHBand="0" w:noVBand="1" w:val="04A0"/>
       </w:tblPr>
       <w:tblGrid>
-        <w:gridCol w:w="5159"/>
-        <w:gridCol w:w="5159"/>
+        <w:gridCol w:w="3439"/>
+        <w:gridCol w:w="3439"/>
+        <w:gridCol w:w="3439"/>
       </w:tblGrid>
       <w:tr>
         <w:tc>
           <w:tcPr>
-            <w:tcW w:type="dxa" w:w="5159"/>
+            <w:tcW w:type="dxa" w:w="3439"/>
           </w:tcPr>
           <w:p>
             <w:pPr>
               <w:pStyle w:val="ListBullet"/>
               <w:spacing w:after="30"/>
-              <w:ind w:left="283" w:hanging="170"/>
+              <w:ind w:left="255" w:hanging="170"/>
             </w:pPr>
             <w:r>
               <w:rPr>
                 <w:sz w:val="19"/>
               </w:rPr>
-              <w:t>Teaching English to young learners (ages 3–12)</w:t>
+              <w:t>Young learners, ages 3–12</w:t>
             </w:r>
           </w:p>
           <w:p>
             <w:pPr>
               <w:pStyle w:val="ListBullet"/>
               <w:spacing w:after="30"/>
-              <w:ind w:left="283" w:hanging="170"/>
+              <w:ind w:left="255" w:hanging="170"/>
             </w:pPr>
             <w:r>
               <w:rPr>
                 <w:sz w:val="19"/>
               </w:rPr>
-              <w:t>Phonics &amp; early literacy instruction</w:t>
+              <w:t>Phonics &amp; early literacy</w:t>
             </w:r>
           </w:p>
           <w:p>
             <w:pPr>
               <w:pStyle w:val="ListBullet"/>
               <w:spacing w:after="30"/>
-              <w:ind w:left="283" w:hanging="170"/>
+              <w:ind w:left="255" w:hanging="170"/>
             </w:pPr>
             <w:r>
               <w:rPr>
                 <w:sz w:val="19"/>
               </w:rPr>
-              <w:t>Total Physical Response (TPR) &amp; play-based learning</w:t>
+              <w:t>TPR &amp; play-based learning</w:t>
             </w:r>
           </w:p>
           <w:p>
             <w:pPr>
               <w:pStyle w:val="ListBullet"/>
               <w:spacing w:after="30"/>
-              <w:ind w:left="283" w:hanging="170"/>
+              <w:ind w:left="255" w:hanging="170"/>
             </w:pPr>
             <w:r>
               <w:rPr>
@@ -524,83 +525,153 @@
             <w:pPr>
               <w:pStyle w:val="ListBullet"/>
               <w:spacing w:after="30"/>
-              <w:ind w:left="283" w:hanging="170"/>
+              <w:ind w:left="255" w:hanging="170"/>
             </w:pPr>
             <w:r>
               <w:rPr>
                 <w:sz w:val="19"/>
               </w:rPr>
-              <w:t>Oral English &amp; pronunciation coaching</w:t>
+              <w:t>Oral English &amp; pronunciation</w:t>
             </w:r>
           </w:p>
         </w:tc>
         <w:tc>
           <w:tcPr>
-            <w:tcW w:type="dxa" w:w="5159"/>
+            <w:tcW w:type="dxa" w:w="3439"/>
           </w:tcPr>
           <w:p>
             <w:pPr>
               <w:pStyle w:val="ListBullet"/>
               <w:spacing w:after="30"/>
-              <w:ind w:left="283" w:hanging="170"/>
+              <w:ind w:left="255" w:hanging="170"/>
             </w:pPr>
             <w:r>
               <w:rPr>
                 <w:sz w:val="19"/>
               </w:rPr>
-              <w:t>Lesson planning &amp; curriculum delivery</w:t>
+              <w:t>Lesson planning &amp; curriculum</w:t>
             </w:r>
           </w:p>
           <w:p>
             <w:pPr>
               <w:pStyle w:val="ListBullet"/>
               <w:spacing w:after="30"/>
-              <w:ind w:left="283" w:hanging="170"/>
+              <w:ind w:left="255" w:hanging="170"/>
             </w:pPr>
             <w:r>
               <w:rPr>
                 <w:sz w:val="19"/>
               </w:rPr>
-              <w:t>Classroom management, large groups</w:t>
+              <w:t>Classroom management</w:t>
             </w:r>
           </w:p>
           <w:p>
             <w:pPr>
               <w:pStyle w:val="ListBullet"/>
               <w:spacing w:after="30"/>
-              <w:ind w:left="283" w:hanging="170"/>
+              <w:ind w:left="255" w:hanging="170"/>
             </w:pPr>
             <w:r>
               <w:rPr>
                 <w:sz w:val="19"/>
               </w:rPr>
-              <w:t>Original teaching-material &amp; video design</w:t>
+              <w:t>Mixed-ability differentiation</w:t>
             </w:r>
           </w:p>
           <w:p>
             <w:pPr>
               <w:pStyle w:val="ListBullet"/>
               <w:spacing w:after="30"/>
-              <w:ind w:left="283" w:hanging="170"/>
+              <w:ind w:left="255" w:hanging="170"/>
             </w:pPr>
             <w:r>
               <w:rPr>
                 <w:sz w:val="19"/>
               </w:rPr>
-              <w:t>Parent communication &amp; progress reporting</w:t>
+              <w:t>Assessment &amp; progress tracking</w:t>
             </w:r>
           </w:p>
           <w:p>
             <w:pPr>
               <w:pStyle w:val="ListBullet"/>
               <w:spacing w:after="30"/>
-              <w:ind w:left="283" w:hanging="170"/>
+              <w:ind w:left="255" w:hanging="170"/>
             </w:pPr>
             <w:r>
               <w:rPr>
                 <w:sz w:val="19"/>
               </w:rPr>
-              <w:t>Mandarin-speaking, China-based since 2023</w:t>
+              <w:t>Exam-oriented tutoring</w:t>
+            </w:r>
+          </w:p>
+        </w:tc>
+        <w:tc>
+          <w:tcPr>
+            <w:tcW w:type="dxa" w:w="3439"/>
+          </w:tcPr>
+          <w:p>
+            <w:pPr>
+              <w:pStyle w:val="ListBullet"/>
+              <w:spacing w:after="30"/>
+              <w:ind w:left="255" w:hanging="170"/>
+            </w:pPr>
+            <w:r>
+              <w:rPr>
+                <w:sz w:val="19"/>
+              </w:rPr>
+              <w:t>Teaching-material design</w:t>
+            </w:r>
+          </w:p>
+          <w:p>
+            <w:pPr>
+              <w:pStyle w:val="ListBullet"/>
+              <w:spacing w:after="30"/>
+              <w:ind w:left="255" w:hanging="170"/>
+            </w:pPr>
+            <w:r>
+              <w:rPr>
+                <w:sz w:val="19"/>
+              </w:rPr>
+              <w:t>Photo &amp; video for school media</w:t>
+            </w:r>
+          </w:p>
+          <w:p>
+            <w:pPr>
+              <w:pStyle w:val="ListBullet"/>
+              <w:spacing w:after="30"/>
+              <w:ind w:left="255" w:hanging="170"/>
+            </w:pPr>
+            <w:r>
+              <w:rPr>
+                <w:sz w:val="19"/>
+              </w:rPr>
+              <w:t>Classroom technology</w:t>
+            </w:r>
+          </w:p>
+          <w:p>
+            <w:pPr>
+              <w:pStyle w:val="ListBullet"/>
+              <w:spacing w:after="30"/>
+              <w:ind w:left="255" w:hanging="170"/>
+            </w:pPr>
+            <w:r>
+              <w:rPr>
+                <w:sz w:val="19"/>
+              </w:rPr>
+              <w:t>Parent communication</w:t>
+            </w:r>
+          </w:p>
+          <w:p>
+            <w:pPr>
+              <w:pStyle w:val="ListBullet"/>
+              <w:spacing w:after="30"/>
+              <w:ind w:left="255" w:hanging="170"/>
+            </w:pPr>
+            <w:r>
+              <w:rPr>
+                <w:sz w:val="19"/>
+              </w:rPr>
+              <w:t>One-to-one &amp; small groups</w:t>
             </w:r>
           </w:p>
         </w:tc>
@@ -636,7 +707,7 @@
           <w:color w:val="15181C"/>
           <w:sz w:val="19"/>
         </w:rPr>
-        <w:t>Master's Degree</w:t>
+        <w:t>Master's Degree in Computer Science</w:t>
       </w:r>
       <w:r>
         <w:rPr>
@@ -652,7 +723,7 @@
           <w:sz w:val="17"/>
         </w:rPr>
         <w:tab/>
-        <w:t>In progress</w:t>
+        <w:t>2024 – Present</w:t>
       </w:r>
     </w:p>
     <w:p>

</xml_diff>

<commit_message>
Add online teaching to the CV in three places
- Key Skills: "Online & hybrid teaching" in place of the vaguer
  "Classroom technology" line, which the strengths band already covers.
- Tutoring role: lessons delivered in person and online.
- Strengths band: reframed the technology bullet as "Teaches online as
  readily as in person".

PDF still fits one A4 page; DOCX regenerated to match.

Co-Authored-By: Claude Opus 5 <noreply@anthropic.com>
Claude-Session: https://claude.ai/code/session_012Zatsfw6xc1NdxPAVuFq8K
</commit_message>
<xml_diff>
--- a/cv/achouak-yassine-teaching-cv.docx
+++ b/cv/achouak-yassine-teaching-cv.docx
@@ -156,13 +156,13 @@
           <w:b/>
           <w:sz w:val="19"/>
         </w:rPr>
-        <w:t>Comfortable with classroom and online technology</w:t>
+        <w:t>Teaches online as readily as in person</w:t>
       </w:r>
       <w:r>
         <w:rPr>
           <w:sz w:val="19"/>
         </w:rPr>
-        <w:t xml:space="preserve"> — a computer science background makes smartboards, online platforms and digital materials routine.</w:t>
+        <w:t xml:space="preserve"> — a computer science background makes online platforms, smartboards and digital materials routine.</w:t>
       </w:r>
     </w:p>
     <w:p>
@@ -420,7 +420,7 @@
         <w:rPr>
           <w:sz w:val="19"/>
         </w:rPr>
-        <w:t>Deliver tailored tutoring to children and adults, building study plans around each student's level and goals, with a focus on conversational fluency, pronunciation and exam-oriented practice.</w:t>
+        <w:t>Deliver tailored tutoring to children and adults, in person and online, building study plans around each student's level and goals, with a focus on conversational fluency, pronunciation and exam-oriented practice.</w:t>
       </w:r>
     </w:p>
     <w:p>
@@ -645,7 +645,7 @@
               <w:rPr>
                 <w:sz w:val="19"/>
               </w:rPr>
-              <w:t>Classroom technology</w:t>
+              <w:t>Online &amp; hybrid teaching</w:t>
             </w:r>
           </w:p>
           <w:p>

</xml_diff>